<commit_message>
add: points 2-3-4 of the development plan in the documentation
to further information check the trello in readme
</commit_message>
<xml_diff>
--- a/Friendnote planning and documentation.docx
+++ b/Friendnote planning and documentation.docx
@@ -2,6 +2,1442 @@
 <file path=word/document.xml><?xml version="1.0" encoding="utf-8"?>
 <w:document xmlns:wpc="http://schemas.microsoft.com/office/word/2010/wordprocessingCanvas" xmlns:cx="http://schemas.microsoft.com/office/drawing/2014/chartex" xmlns:cx1="http://schemas.microsoft.com/office/drawing/2015/9/8/chartex" xmlns:cx2="http://schemas.microsoft.com/office/drawing/2015/10/21/chartex" xmlns:cx3="http://schemas.microsoft.com/office/drawing/2016/5/9/chartex" xmlns:cx4="http://schemas.microsoft.com/office/drawing/2016/5/10/chartex" xmlns:cx5="http://schemas.microsoft.com/office/drawing/2016/5/11/chartex" xmlns:cx6="http://schemas.microsoft.com/office/drawing/2016/5/12/chartex" xmlns:cx7="http://schemas.microsoft.com/office/drawing/2016/5/13/chartex" xmlns:cx8="http://schemas.microsoft.com/office/drawing/2016/5/14/chartex" xmlns:mc="http://schemas.openxmlformats.org/markup-compatibility/2006" xmlns:aink="http://schemas.microsoft.com/office/drawing/2016/ink" xmlns:am3d="http://schemas.microsoft.com/office/drawing/2017/model3d" xmlns:o="urn:schemas-microsoft-com:office:office" xmlns:oel="http://schemas.microsoft.com/office/2019/extlst" xmlns:r="http://schemas.openxmlformats.org/officeDocument/2006/relationships" xmlns:m="http://schemas.openxmlformats.org/officeDocument/2006/math" xmlns:v="urn:schemas-microsoft-com:vml" xmlns:wp14="http://schemas.microsoft.com/office/word/2010/wordprocessingDrawing" xmlns:wp="http://schemas.openxmlformats.org/drawingml/2006/wordprocessingDrawing" xmlns:w10="urn:schemas-microsoft-com:office:word" xmlns:w="http://schemas.openxmlformats.org/wordprocessingml/2006/main" xmlns:w14="http://schemas.microsoft.com/office/word/2010/wordml" xmlns:w15="http://schemas.microsoft.com/office/word/2012/wordml" xmlns:w16cex="http://schemas.microsoft.com/office/word/2018/wordml/cex" xmlns:w16cid="http://schemas.microsoft.com/office/word/2016/wordml/cid" xmlns:w16="http://schemas.microsoft.com/office/word/2018/wordml" xmlns:w16du="http://schemas.microsoft.com/office/word/2023/wordml/word16du" xmlns:w16sdtdh="http://schemas.microsoft.com/office/word/2020/wordml/sdtdatahash" xmlns:w16sdtfl="http://schemas.microsoft.com/office/word/2024/wordml/sdtformatlock" xmlns:w16se="http://schemas.microsoft.com/office/word/2015/wordml/symex" xmlns:wpg="http://schemas.microsoft.com/office/word/2010/wordprocessingGroup" xmlns:wpi="http://schemas.microsoft.com/office/word/2010/wordprocessingInk" xmlns:wne="http://schemas.microsoft.com/office/word/2006/wordml" xmlns:wps="http://schemas.microsoft.com/office/word/2010/wordprocessingShape" mc:Ignorable="w14 w15 w16se w16cid w16 w16cex w16sdtdh w16sdtfl w16du wp14">
   <w:body>
+    <w:p>
+      <w:pPr>
+        <w:pStyle w:val="Ttulo1"/>
+        <w:jc w:val="center"/>
+      </w:pPr>
+      <w:proofErr w:type="spellStart"/>
+      <w:r>
+        <w:t>FriendNote</w:t>
+      </w:r>
+      <w:proofErr w:type="spellEnd"/>
+    </w:p>
+    <w:p/>
+    <w:p/>
+    <w:p/>
+    <w:p/>
+    <w:p/>
+    <w:p/>
+    <w:p/>
+    <w:p/>
+    <w:p/>
+    <w:p/>
+    <w:p/>
+    <w:p>
+      <w:pPr>
+        <w:jc w:val="center"/>
+        <w:rPr>
+          <w:rFonts w:ascii="Times New Roman" w:hAnsi="Times New Roman" w:cs="Times New Roman"/>
+        </w:rPr>
+      </w:pPr>
+      <w:r>
+        <w:rPr>
+          <w:rFonts w:ascii="Times New Roman" w:hAnsi="Times New Roman" w:cs="Times New Roman"/>
+        </w:rPr>
+        <w:t xml:space="preserve">Andres Felipe Rojas </w:t>
+      </w:r>
+      <w:proofErr w:type="spellStart"/>
+      <w:r>
+        <w:rPr>
+          <w:rFonts w:ascii="Times New Roman" w:hAnsi="Times New Roman" w:cs="Times New Roman"/>
+        </w:rPr>
+        <w:t>Sanchez</w:t>
+      </w:r>
+      <w:proofErr w:type="spellEnd"/>
+    </w:p>
+    <w:p>
+      <w:pPr>
+        <w:jc w:val="center"/>
+        <w:rPr>
+          <w:rFonts w:ascii="Times New Roman" w:hAnsi="Times New Roman" w:cs="Times New Roman"/>
+        </w:rPr>
+      </w:pPr>
+    </w:p>
+    <w:p>
+      <w:pPr>
+        <w:jc w:val="center"/>
+        <w:rPr>
+          <w:rFonts w:ascii="Times New Roman" w:hAnsi="Times New Roman" w:cs="Times New Roman"/>
+        </w:rPr>
+      </w:pPr>
+    </w:p>
+    <w:p>
+      <w:pPr>
+        <w:jc w:val="center"/>
+        <w:rPr>
+          <w:rFonts w:ascii="Times New Roman" w:hAnsi="Times New Roman" w:cs="Times New Roman"/>
+        </w:rPr>
+      </w:pPr>
+    </w:p>
+    <w:p>
+      <w:pPr>
+        <w:jc w:val="center"/>
+        <w:rPr>
+          <w:rFonts w:ascii="Times New Roman" w:hAnsi="Times New Roman" w:cs="Times New Roman"/>
+        </w:rPr>
+      </w:pPr>
+    </w:p>
+    <w:p>
+      <w:pPr>
+        <w:jc w:val="center"/>
+        <w:rPr>
+          <w:rFonts w:ascii="Times New Roman" w:hAnsi="Times New Roman" w:cs="Times New Roman"/>
+        </w:rPr>
+      </w:pPr>
+    </w:p>
+    <w:p>
+      <w:pPr>
+        <w:jc w:val="center"/>
+        <w:rPr>
+          <w:rFonts w:ascii="Times New Roman" w:hAnsi="Times New Roman" w:cs="Times New Roman"/>
+        </w:rPr>
+      </w:pPr>
+    </w:p>
+    <w:p>
+      <w:pPr>
+        <w:jc w:val="center"/>
+        <w:rPr>
+          <w:rFonts w:ascii="Times New Roman" w:hAnsi="Times New Roman" w:cs="Times New Roman"/>
+        </w:rPr>
+      </w:pPr>
+    </w:p>
+    <w:p>
+      <w:pPr>
+        <w:jc w:val="center"/>
+        <w:rPr>
+          <w:rFonts w:ascii="Times New Roman" w:hAnsi="Times New Roman" w:cs="Times New Roman"/>
+        </w:rPr>
+      </w:pPr>
+    </w:p>
+    <w:p>
+      <w:pPr>
+        <w:jc w:val="center"/>
+        <w:rPr>
+          <w:rFonts w:ascii="Times New Roman" w:hAnsi="Times New Roman" w:cs="Times New Roman"/>
+        </w:rPr>
+      </w:pPr>
+    </w:p>
+    <w:p>
+      <w:pPr>
+        <w:jc w:val="center"/>
+        <w:rPr>
+          <w:rFonts w:ascii="Times New Roman" w:hAnsi="Times New Roman" w:cs="Times New Roman"/>
+        </w:rPr>
+      </w:pPr>
+      <w:r>
+        <w:rPr>
+          <w:rFonts w:ascii="Times New Roman" w:hAnsi="Times New Roman" w:cs="Times New Roman"/>
+        </w:rPr>
+        <w:t>Universidad del valle</w:t>
+      </w:r>
+    </w:p>
+    <w:p>
+      <w:pPr>
+        <w:jc w:val="center"/>
+        <w:rPr>
+          <w:rFonts w:ascii="Times New Roman" w:hAnsi="Times New Roman" w:cs="Times New Roman"/>
+        </w:rPr>
+      </w:pPr>
+      <w:r>
+        <w:rPr>
+          <w:rFonts w:ascii="Times New Roman" w:hAnsi="Times New Roman" w:cs="Times New Roman"/>
+        </w:rPr>
+        <w:t xml:space="preserve">Sede </w:t>
+      </w:r>
+      <w:proofErr w:type="spellStart"/>
+      <w:r>
+        <w:rPr>
+          <w:rFonts w:ascii="Times New Roman" w:hAnsi="Times New Roman" w:cs="Times New Roman"/>
+        </w:rPr>
+        <w:t>Tulua</w:t>
+      </w:r>
+      <w:proofErr w:type="spellEnd"/>
+    </w:p>
+    <w:p>
+      <w:pPr>
+        <w:rPr>
+          <w:rFonts w:ascii="Times New Roman" w:hAnsi="Times New Roman" w:cs="Times New Roman"/>
+        </w:rPr>
+      </w:pPr>
+      <w:r>
+        <w:rPr>
+          <w:rFonts w:ascii="Times New Roman" w:hAnsi="Times New Roman" w:cs="Times New Roman"/>
+        </w:rPr>
+        <w:br w:type="page"/>
+      </w:r>
+    </w:p>
+    <w:p>
+      <w:pPr>
+        <w:pStyle w:val="Ttulo2"/>
+        <w:numPr>
+          <w:ilvl w:val="0"/>
+          <w:numId w:val="1"/>
+        </w:numPr>
+      </w:pPr>
+      <w:r>
+        <w:lastRenderedPageBreak/>
+        <w:t>Definición del Problema:</w:t>
+      </w:r>
+    </w:p>
+    <w:p/>
+    <w:p>
+      <w:r>
+        <w:t xml:space="preserve">Los apuntes son una pieza clave para el </w:t>
+      </w:r>
+      <w:proofErr w:type="gramStart"/>
+      <w:r>
+        <w:t>aprendizaje  y</w:t>
+      </w:r>
+      <w:proofErr w:type="gramEnd"/>
+      <w:r>
+        <w:t xml:space="preserve"> el </w:t>
+      </w:r>
+      <w:proofErr w:type="gramStart"/>
+      <w:r>
+        <w:t>desarrollo  personal</w:t>
+      </w:r>
+      <w:proofErr w:type="gramEnd"/>
+      <w:r>
+        <w:t xml:space="preserve">, permiten entender, simplificar y ejemplificar los distintos temas académicos, además de ser una poderosa herramienta </w:t>
+      </w:r>
+      <w:r>
+        <w:t>de compañerismo y organización, con esto en mente, Parece lógica la necesidad de crear herramientas capaces de facilitar y agrupar este conocimiento en un solo lugar.</w:t>
+      </w:r>
+    </w:p>
+    <w:p/>
+    <w:p>
+      <w:r>
+        <w:t>Aunque en la actualidad existen distintas aplicaciones para tomar notas de manera dinámica y organizada, al momento de exportar o compartir estos apuntes libremente se ve muy limitado, se debe contar con el enlace directo o ser parte de algún tipo de organización de manera obligatoria para su fácil acceso, haciendo que los apuntes se pierdan al momento en que la conexión social se pierda.</w:t>
+      </w:r>
+    </w:p>
+    <w:p/>
+    <w:p>
+      <w:r>
+        <w:t xml:space="preserve">Con esta problemática en mente, el desarrollo de </w:t>
+      </w:r>
+      <w:proofErr w:type="spellStart"/>
+      <w:r>
+        <w:t>Friendnote</w:t>
+      </w:r>
+      <w:proofErr w:type="spellEnd"/>
+      <w:r>
+        <w:t xml:space="preserve"> atiende a la necesidad de apuntes accesibles, fáciles y sin barreras abusivas para su encuentro. Permitiendo a los usuarios subir sus notas y/o apuntes en la aplicación, y en base a su utilidad y/o los usuarios que las encuentren y usen recibir recompensas, a la vez que el estudiante en necesidad de estos apuntes tiene un acceso libre y una base de datos abierta para ayudarse en las temáticas filtradas por institución, materia e incluso docente.</w:t>
+      </w:r>
+    </w:p>
+    <w:p/>
+    <w:p>
+      <w:pPr>
+        <w:pStyle w:val="Ttulo2"/>
+        <w:numPr>
+          <w:ilvl w:val="1"/>
+          <w:numId w:val="1"/>
+        </w:numPr>
+      </w:pPr>
+      <w:r>
+        <w:t>Usuarios objetivo:</w:t>
+      </w:r>
+    </w:p>
+    <w:p>
+      <w:r>
+        <w:t xml:space="preserve">Los usuarios a los que </w:t>
+      </w:r>
+      <w:proofErr w:type="spellStart"/>
+      <w:r>
+        <w:t>FriendNote</w:t>
+      </w:r>
+      <w:proofErr w:type="spellEnd"/>
+      <w:r>
+        <w:t xml:space="preserve"> apunta son principalmente estudiantes a partir de sexto grado(bachillerato) que empiezan ya a necesitar una metodología mas ordenada de estudio hasta estudiantes universitarios tanto de pregrado, especialización o maestría que ya están enfrentando las etapas mas duras de aprendizaje donde la sensación de comunidad y compañerismo puede</w:t>
+      </w:r>
+      <w:r>
+        <w:t>n ser claves en el desarrollo de la titulación.</w:t>
+      </w:r>
+    </w:p>
+    <w:p>
+      <w:r>
+        <w:br w:type="page"/>
+      </w:r>
+    </w:p>
+    <w:p>
+      <w:pPr>
+        <w:pStyle w:val="Ttulo2"/>
+        <w:numPr>
+          <w:ilvl w:val="0"/>
+          <w:numId w:val="1"/>
+        </w:numPr>
+      </w:pPr>
+      <w:r>
+        <w:lastRenderedPageBreak/>
+        <w:t>Investigación de usuarios</w:t>
+      </w:r>
+    </w:p>
+    <w:p>
+      <w:r>
+        <w:br w:type="page"/>
+      </w:r>
+    </w:p>
+    <w:p>
+      <w:pPr>
+        <w:pStyle w:val="Ttulo2"/>
+        <w:numPr>
+          <w:ilvl w:val="0"/>
+          <w:numId w:val="1"/>
+        </w:numPr>
+      </w:pPr>
+      <w:proofErr w:type="spellStart"/>
+      <w:r>
+        <w:lastRenderedPageBreak/>
+        <w:t>Analisis</w:t>
+      </w:r>
+      <w:proofErr w:type="spellEnd"/>
+      <w:r>
+        <w:t xml:space="preserve"> de competencia:</w:t>
+      </w:r>
+    </w:p>
+    <w:p>
+      <w:pPr>
+        <w:pStyle w:val="Ttulo3"/>
+        <w:numPr>
+          <w:ilvl w:val="1"/>
+          <w:numId w:val="1"/>
+        </w:numPr>
+      </w:pPr>
+      <w:proofErr w:type="spellStart"/>
+      <w:r>
+        <w:t>Notion</w:t>
+      </w:r>
+      <w:proofErr w:type="spellEnd"/>
+      <w:r>
+        <w:t>:</w:t>
+      </w:r>
+    </w:p>
+    <w:p>
+      <w:pPr>
+        <w:rPr>
+          <w:rFonts w:ascii="Times New Roman" w:hAnsi="Times New Roman" w:cs="Times New Roman"/>
+          <w:sz w:val="36"/>
+          <w:szCs w:val="36"/>
+        </w:rPr>
+      </w:pPr>
+      <w:r>
+        <w:rPr>
+          <w:rFonts w:ascii="Times New Roman" w:hAnsi="Times New Roman" w:cs="Times New Roman"/>
+          <w:sz w:val="36"/>
+          <w:szCs w:val="36"/>
+        </w:rPr>
+        <w:t>Fortalezas</w:t>
+      </w:r>
+      <w:r>
+        <w:rPr>
+          <w:rFonts w:ascii="Times New Roman" w:hAnsi="Times New Roman" w:cs="Times New Roman"/>
+          <w:sz w:val="36"/>
+          <w:szCs w:val="36"/>
+        </w:rPr>
+        <w:t>:</w:t>
+      </w:r>
+    </w:p>
+    <w:p>
+      <w:pPr>
+        <w:pStyle w:val="Prrafodelista"/>
+        <w:numPr>
+          <w:ilvl w:val="0"/>
+          <w:numId w:val="2"/>
+        </w:numPr>
+        <w:rPr>
+          <w:sz w:val="32"/>
+          <w:szCs w:val="32"/>
+        </w:rPr>
+      </w:pPr>
+      <w:r>
+        <w:rPr>
+          <w:sz w:val="32"/>
+          <w:szCs w:val="32"/>
+        </w:rPr>
+        <w:t>Organización muy flexible</w:t>
+      </w:r>
+      <w:r>
+        <w:rPr>
+          <w:sz w:val="32"/>
+          <w:szCs w:val="32"/>
+        </w:rPr>
+        <w:t>:</w:t>
+      </w:r>
+    </w:p>
+    <w:p>
+      <w:r>
+        <w:t>Puedes combinar texto, tablas, listas, calendarios, bases de datos, imágenes y código en una sola página. Sirve tanto para apuntes rápidos como para documentación compleja.</w:t>
+      </w:r>
+    </w:p>
+    <w:p>
+      <w:pPr>
+        <w:pStyle w:val="Prrafodelista"/>
+        <w:numPr>
+          <w:ilvl w:val="0"/>
+          <w:numId w:val="2"/>
+        </w:numPr>
+        <w:rPr>
+          <w:sz w:val="32"/>
+          <w:szCs w:val="32"/>
+        </w:rPr>
+      </w:pPr>
+      <w:r>
+        <w:rPr>
+          <w:sz w:val="32"/>
+          <w:szCs w:val="32"/>
+        </w:rPr>
+        <w:t>Edición colaborativa en tiempo real</w:t>
+      </w:r>
+      <w:r>
+        <w:rPr>
+          <w:sz w:val="32"/>
+          <w:szCs w:val="32"/>
+        </w:rPr>
+        <w:t>:</w:t>
+      </w:r>
+    </w:p>
+    <w:p>
+      <w:r>
+        <w:t xml:space="preserve">Varias personas pueden editar simultáneamente, similar a Google </w:t>
+      </w:r>
+      <w:proofErr w:type="spellStart"/>
+      <w:r>
+        <w:t>Docs</w:t>
+      </w:r>
+      <w:proofErr w:type="spellEnd"/>
+      <w:r>
+        <w:t>, útil para trabajos grupales.</w:t>
+      </w:r>
+    </w:p>
+    <w:p/>
+    <w:p>
+      <w:pPr>
+        <w:pStyle w:val="Prrafodelista"/>
+        <w:numPr>
+          <w:ilvl w:val="0"/>
+          <w:numId w:val="2"/>
+        </w:numPr>
+        <w:rPr>
+          <w:sz w:val="32"/>
+          <w:szCs w:val="32"/>
+        </w:rPr>
+      </w:pPr>
+      <w:r>
+        <w:rPr>
+          <w:sz w:val="32"/>
+          <w:szCs w:val="32"/>
+        </w:rPr>
+        <w:t>Sistema de enlaces internos muy fuerte</w:t>
+      </w:r>
+    </w:p>
+    <w:p>
+      <w:r>
+        <w:t xml:space="preserve">Puedes conectar apuntes entre sí usando menciones y </w:t>
+      </w:r>
+      <w:proofErr w:type="spellStart"/>
+      <w:r>
+        <w:t>backlinks</w:t>
+      </w:r>
+      <w:proofErr w:type="spellEnd"/>
+      <w:r>
+        <w:t>, creando una especie de “wiki personal”.</w:t>
+      </w:r>
+      <w:r>
+        <w:t xml:space="preserve"> </w:t>
+      </w:r>
+    </w:p>
+    <w:p>
+      <w:pPr>
+        <w:rPr>
+          <w:sz w:val="32"/>
+          <w:szCs w:val="32"/>
+        </w:rPr>
+      </w:pPr>
+    </w:p>
+    <w:p>
+      <w:pPr>
+        <w:pStyle w:val="Prrafodelista"/>
+        <w:numPr>
+          <w:ilvl w:val="0"/>
+          <w:numId w:val="2"/>
+        </w:numPr>
+      </w:pPr>
+      <w:r>
+        <w:t>Sincronización multiplataforma</w:t>
+      </w:r>
+    </w:p>
+    <w:p>
+      <w:pPr>
+        <w:ind w:left="360"/>
+      </w:pPr>
+      <w:r>
+        <w:t>Funciona en navegador, escritorio y móvil, manteniendo los apuntes sincronizados.</w:t>
+      </w:r>
+      <w:r>
+        <w:t xml:space="preserve"> </w:t>
+      </w:r>
+    </w:p>
+    <w:p>
+      <w:pPr>
+        <w:rPr>
+          <w:rFonts w:ascii="Times New Roman" w:hAnsi="Times New Roman" w:cs="Times New Roman"/>
+          <w:sz w:val="36"/>
+          <w:szCs w:val="36"/>
+        </w:rPr>
+      </w:pPr>
+      <w:r>
+        <w:rPr>
+          <w:rFonts w:ascii="Times New Roman" w:hAnsi="Times New Roman" w:cs="Times New Roman"/>
+          <w:sz w:val="36"/>
+          <w:szCs w:val="36"/>
+        </w:rPr>
+        <w:br w:type="page"/>
+      </w:r>
+    </w:p>
+    <w:p>
+      <w:pPr>
+        <w:rPr>
+          <w:rFonts w:ascii="Times New Roman" w:hAnsi="Times New Roman" w:cs="Times New Roman"/>
+          <w:sz w:val="36"/>
+          <w:szCs w:val="36"/>
+        </w:rPr>
+      </w:pPr>
+      <w:r>
+        <w:rPr>
+          <w:rFonts w:ascii="Times New Roman" w:hAnsi="Times New Roman" w:cs="Times New Roman"/>
+          <w:sz w:val="36"/>
+          <w:szCs w:val="36"/>
+        </w:rPr>
+        <w:lastRenderedPageBreak/>
+        <w:t>Debilidades</w:t>
+      </w:r>
+      <w:r>
+        <w:rPr>
+          <w:rFonts w:ascii="Times New Roman" w:hAnsi="Times New Roman" w:cs="Times New Roman"/>
+          <w:sz w:val="36"/>
+          <w:szCs w:val="36"/>
+        </w:rPr>
+        <w:t>:</w:t>
+      </w:r>
+    </w:p>
+    <w:p>
+      <w:pPr>
+        <w:pStyle w:val="Prrafodelista"/>
+        <w:numPr>
+          <w:ilvl w:val="0"/>
+          <w:numId w:val="2"/>
+        </w:numPr>
+        <w:rPr>
+          <w:rFonts w:ascii="Times New Roman" w:hAnsi="Times New Roman" w:cs="Times New Roman"/>
+          <w:sz w:val="32"/>
+          <w:szCs w:val="32"/>
+        </w:rPr>
+      </w:pPr>
+      <w:r>
+        <w:rPr>
+          <w:rFonts w:ascii="Times New Roman" w:hAnsi="Times New Roman" w:cs="Times New Roman"/>
+          <w:sz w:val="32"/>
+          <w:szCs w:val="32"/>
+        </w:rPr>
+        <w:t>Compartir “sin enlace directo” tiene límites</w:t>
+      </w:r>
+    </w:p>
+    <w:p>
+      <w:pPr>
+        <w:rPr>
+          <w:rFonts w:ascii="Times New Roman" w:hAnsi="Times New Roman" w:cs="Times New Roman"/>
+        </w:rPr>
+      </w:pPr>
+      <w:r>
+        <w:rPr>
+          <w:rFonts w:ascii="Times New Roman" w:hAnsi="Times New Roman" w:cs="Times New Roman"/>
+        </w:rPr>
+        <w:t xml:space="preserve">Si alguien no tiene acceso al </w:t>
+      </w:r>
+      <w:proofErr w:type="spellStart"/>
+      <w:r>
+        <w:rPr>
+          <w:rFonts w:ascii="Times New Roman" w:hAnsi="Times New Roman" w:cs="Times New Roman"/>
+        </w:rPr>
+        <w:t>workspace</w:t>
+      </w:r>
+      <w:proofErr w:type="spellEnd"/>
+      <w:r>
+        <w:rPr>
+          <w:rFonts w:ascii="Times New Roman" w:hAnsi="Times New Roman" w:cs="Times New Roman"/>
+        </w:rPr>
+        <w:t xml:space="preserve"> o a la página padre, no podrá encontrar la </w:t>
+      </w:r>
+      <w:proofErr w:type="gramStart"/>
+      <w:r>
+        <w:rPr>
+          <w:rFonts w:ascii="Times New Roman" w:hAnsi="Times New Roman" w:cs="Times New Roman"/>
+        </w:rPr>
+        <w:t>nota</w:t>
+      </w:r>
+      <w:proofErr w:type="gramEnd"/>
+      <w:r>
+        <w:rPr>
+          <w:rFonts w:ascii="Times New Roman" w:hAnsi="Times New Roman" w:cs="Times New Roman"/>
+        </w:rPr>
+        <w:t xml:space="preserve"> aunque exista.</w:t>
+      </w:r>
+    </w:p>
+    <w:p>
+      <w:pPr>
+        <w:rPr>
+          <w:rFonts w:ascii="Times New Roman" w:hAnsi="Times New Roman" w:cs="Times New Roman"/>
+        </w:rPr>
+      </w:pPr>
+      <w:r>
+        <w:rPr>
+          <w:rFonts w:ascii="Times New Roman" w:hAnsi="Times New Roman" w:cs="Times New Roman"/>
+        </w:rPr>
+        <w:t>Es decir:</w:t>
+      </w:r>
+    </w:p>
+    <w:p>
+      <w:pPr>
+        <w:rPr>
+          <w:rFonts w:ascii="Times New Roman" w:hAnsi="Times New Roman" w:cs="Times New Roman"/>
+        </w:rPr>
+      </w:pPr>
+      <w:r>
+        <w:rPr>
+          <w:rFonts w:ascii="Times New Roman" w:hAnsi="Times New Roman" w:cs="Times New Roman"/>
+        </w:rPr>
+        <w:t>sí funciona bien dentro de un espacio compartido,</w:t>
+      </w:r>
+    </w:p>
+    <w:p>
+      <w:pPr>
+        <w:rPr>
+          <w:rFonts w:ascii="Times New Roman" w:hAnsi="Times New Roman" w:cs="Times New Roman"/>
+        </w:rPr>
+      </w:pPr>
+      <w:r>
+        <w:rPr>
+          <w:rFonts w:ascii="Times New Roman" w:hAnsi="Times New Roman" w:cs="Times New Roman"/>
+        </w:rPr>
+        <w:t>pero no es tan abierto como un foro o una wiki pública indexada.</w:t>
+      </w:r>
+    </w:p>
+    <w:p>
+      <w:pPr>
+        <w:pStyle w:val="Prrafodelista"/>
+        <w:numPr>
+          <w:ilvl w:val="0"/>
+          <w:numId w:val="2"/>
+        </w:numPr>
+        <w:rPr>
+          <w:rFonts w:ascii="Times New Roman" w:hAnsi="Times New Roman" w:cs="Times New Roman"/>
+          <w:sz w:val="32"/>
+          <w:szCs w:val="32"/>
+        </w:rPr>
+      </w:pPr>
+      <w:r>
+        <w:rPr>
+          <w:rFonts w:ascii="Times New Roman" w:hAnsi="Times New Roman" w:cs="Times New Roman"/>
+          <w:sz w:val="32"/>
+          <w:szCs w:val="32"/>
+        </w:rPr>
+        <w:t>Gestión de permisos puede ser confusa</w:t>
+      </w:r>
+    </w:p>
+    <w:p>
+      <w:pPr>
+        <w:ind w:left="360"/>
+        <w:rPr>
+          <w:rFonts w:ascii="Times New Roman" w:hAnsi="Times New Roman" w:cs="Times New Roman"/>
+        </w:rPr>
+      </w:pPr>
+      <w:r>
+        <w:rPr>
+          <w:rFonts w:ascii="Times New Roman" w:hAnsi="Times New Roman" w:cs="Times New Roman"/>
+        </w:rPr>
+        <w:t>Hay diferencias entre:</w:t>
+      </w:r>
+    </w:p>
+    <w:p>
+      <w:pPr>
+        <w:pStyle w:val="Prrafodelista"/>
+        <w:rPr>
+          <w:rFonts w:ascii="Times New Roman" w:hAnsi="Times New Roman" w:cs="Times New Roman"/>
+        </w:rPr>
+      </w:pPr>
+      <w:r>
+        <w:rPr>
+          <w:rFonts w:ascii="Times New Roman" w:hAnsi="Times New Roman" w:cs="Times New Roman"/>
+        </w:rPr>
+        <w:t xml:space="preserve">compartir página, </w:t>
+      </w:r>
+    </w:p>
+    <w:p>
+      <w:pPr>
+        <w:pStyle w:val="Prrafodelista"/>
+        <w:rPr>
+          <w:rFonts w:ascii="Times New Roman" w:hAnsi="Times New Roman" w:cs="Times New Roman"/>
+        </w:rPr>
+      </w:pPr>
+      <w:r>
+        <w:rPr>
+          <w:rFonts w:ascii="Times New Roman" w:hAnsi="Times New Roman" w:cs="Times New Roman"/>
+        </w:rPr>
+        <w:t xml:space="preserve">compartir </w:t>
+      </w:r>
+      <w:proofErr w:type="spellStart"/>
+      <w:r>
+        <w:rPr>
+          <w:rFonts w:ascii="Times New Roman" w:hAnsi="Times New Roman" w:cs="Times New Roman"/>
+        </w:rPr>
+        <w:t>workspace</w:t>
+      </w:r>
+      <w:proofErr w:type="spellEnd"/>
+      <w:r>
+        <w:rPr>
+          <w:rFonts w:ascii="Times New Roman" w:hAnsi="Times New Roman" w:cs="Times New Roman"/>
+        </w:rPr>
+        <w:t xml:space="preserve">, </w:t>
+      </w:r>
+    </w:p>
+    <w:p>
+      <w:pPr>
+        <w:pStyle w:val="Prrafodelista"/>
+        <w:rPr>
+          <w:rFonts w:ascii="Times New Roman" w:hAnsi="Times New Roman" w:cs="Times New Roman"/>
+        </w:rPr>
+      </w:pPr>
+      <w:r>
+        <w:rPr>
+          <w:rFonts w:ascii="Times New Roman" w:hAnsi="Times New Roman" w:cs="Times New Roman"/>
+        </w:rPr>
+        <w:t xml:space="preserve">acceso de edición, </w:t>
+      </w:r>
+    </w:p>
+    <w:p>
+      <w:pPr>
+        <w:pStyle w:val="Prrafodelista"/>
+        <w:rPr>
+          <w:rFonts w:ascii="Times New Roman" w:hAnsi="Times New Roman" w:cs="Times New Roman"/>
+        </w:rPr>
+      </w:pPr>
+      <w:r>
+        <w:rPr>
+          <w:rFonts w:ascii="Times New Roman" w:hAnsi="Times New Roman" w:cs="Times New Roman"/>
+        </w:rPr>
+        <w:t xml:space="preserve">acceso de comentario, </w:t>
+      </w:r>
+    </w:p>
+    <w:p>
+      <w:pPr>
+        <w:pStyle w:val="Prrafodelista"/>
+        <w:rPr>
+          <w:rFonts w:ascii="Times New Roman" w:hAnsi="Times New Roman" w:cs="Times New Roman"/>
+        </w:rPr>
+      </w:pPr>
+      <w:r>
+        <w:rPr>
+          <w:rFonts w:ascii="Times New Roman" w:hAnsi="Times New Roman" w:cs="Times New Roman"/>
+        </w:rPr>
+        <w:t>publicación web.</w:t>
+      </w:r>
+    </w:p>
+    <w:p>
+      <w:pPr>
+        <w:pStyle w:val="Prrafodelista"/>
+        <w:rPr>
+          <w:rFonts w:ascii="Times New Roman" w:hAnsi="Times New Roman" w:cs="Times New Roman"/>
+        </w:rPr>
+      </w:pPr>
+    </w:p>
+    <w:p>
+      <w:pPr>
+        <w:pStyle w:val="Prrafodelista"/>
+        <w:numPr>
+          <w:ilvl w:val="0"/>
+          <w:numId w:val="2"/>
+        </w:numPr>
+        <w:rPr>
+          <w:rFonts w:ascii="Times New Roman" w:hAnsi="Times New Roman" w:cs="Times New Roman"/>
+          <w:sz w:val="32"/>
+          <w:szCs w:val="32"/>
+        </w:rPr>
+      </w:pPr>
+      <w:r>
+        <w:rPr>
+          <w:rFonts w:ascii="Times New Roman" w:hAnsi="Times New Roman" w:cs="Times New Roman"/>
+          <w:sz w:val="32"/>
+          <w:szCs w:val="32"/>
+        </w:rPr>
+        <w:t>Curva de aprendizaje inicial</w:t>
+      </w:r>
+    </w:p>
+    <w:p>
+      <w:pPr>
+        <w:ind w:left="360"/>
+        <w:rPr>
+          <w:rFonts w:ascii="Times New Roman" w:hAnsi="Times New Roman" w:cs="Times New Roman"/>
+        </w:rPr>
+      </w:pPr>
+      <w:r>
+        <w:rPr>
+          <w:rFonts w:ascii="Times New Roman" w:hAnsi="Times New Roman" w:cs="Times New Roman"/>
+        </w:rPr>
+        <w:t>Al tener tantas funciones, algunas personas solo quieren “escribir apuntes” y terminan confundidas con bases de datos, bloques y configuraciones.</w:t>
+      </w:r>
+    </w:p>
+    <w:p>
+      <w:pPr>
+        <w:rPr>
+          <w:rFonts w:ascii="Times New Roman" w:hAnsi="Times New Roman" w:cs="Times New Roman"/>
+        </w:rPr>
+      </w:pPr>
+      <w:r>
+        <w:rPr>
+          <w:rFonts w:ascii="Times New Roman" w:hAnsi="Times New Roman" w:cs="Times New Roman"/>
+        </w:rPr>
+        <w:br w:type="page"/>
+      </w:r>
+    </w:p>
+    <w:p>
+      <w:pPr>
+        <w:ind w:left="360"/>
+        <w:rPr>
+          <w:rFonts w:ascii="Times New Roman" w:hAnsi="Times New Roman" w:cs="Times New Roman"/>
+        </w:rPr>
+      </w:pPr>
+    </w:p>
+    <w:p>
+      <w:pPr>
+        <w:pStyle w:val="Ttulo3"/>
+        <w:numPr>
+          <w:ilvl w:val="1"/>
+          <w:numId w:val="1"/>
+        </w:numPr>
+      </w:pPr>
+      <w:r>
+        <w:t>Wuolah</w:t>
+      </w:r>
+    </w:p>
+    <w:p>
+      <w:pPr>
+        <w:spacing w:after="0" w:line="240" w:lineRule="auto"/>
+        <w:rPr>
+          <w:rFonts w:ascii="Times New Roman" w:eastAsia="Times New Roman" w:hAnsi="Symbol" w:cs="Times New Roman"/>
+          <w:kern w:val="0"/>
+          <w:sz w:val="40"/>
+          <w:szCs w:val="40"/>
+          <w:lang w:eastAsia="es-CO"/>
+          <w14:ligatures w14:val="none"/>
+        </w:rPr>
+      </w:pPr>
+      <w:r>
+        <w:rPr>
+          <w:rFonts w:ascii="Times New Roman" w:eastAsia="Times New Roman" w:hAnsi="Symbol" w:cs="Times New Roman"/>
+          <w:kern w:val="0"/>
+          <w:sz w:val="40"/>
+          <w:szCs w:val="40"/>
+          <w:lang w:eastAsia="es-CO"/>
+          <w14:ligatures w14:val="none"/>
+        </w:rPr>
+        <w:t>Fortalezas</w:t>
+      </w:r>
+    </w:p>
+    <w:p>
+      <w:pPr>
+        <w:pStyle w:val="Prrafodelista"/>
+        <w:numPr>
+          <w:ilvl w:val="0"/>
+          <w:numId w:val="2"/>
+        </w:numPr>
+        <w:spacing w:after="0" w:line="240" w:lineRule="auto"/>
+        <w:rPr>
+          <w:rFonts w:ascii="Times New Roman" w:eastAsia="Times New Roman" w:hAnsi="Times New Roman" w:cs="Times New Roman"/>
+          <w:kern w:val="0"/>
+          <w:lang w:eastAsia="es-CO"/>
+          <w14:ligatures w14:val="none"/>
+        </w:rPr>
+      </w:pPr>
+      <w:r>
+        <w:rPr>
+          <w:rFonts w:ascii="Times New Roman" w:eastAsia="Times New Roman" w:hAnsi="Times New Roman" w:cs="Times New Roman"/>
+          <w:kern w:val="0"/>
+          <w:lang w:eastAsia="es-CO"/>
+          <w14:ligatures w14:val="none"/>
+        </w:rPr>
+        <w:t>Facilidad extrema para compartir documentos</w:t>
+      </w:r>
+      <w:r>
+        <w:rPr>
+          <w:rFonts w:ascii="Times New Roman" w:eastAsia="Times New Roman" w:hAnsi="Times New Roman" w:cs="Times New Roman"/>
+          <w:kern w:val="0"/>
+          <w:lang w:eastAsia="es-CO"/>
+          <w14:ligatures w14:val="none"/>
+        </w:rPr>
+        <w:t xml:space="preserve"> </w:t>
+      </w:r>
+    </w:p>
+    <w:p>
+      <w:pPr>
+        <w:spacing w:after="0" w:line="240" w:lineRule="auto"/>
+        <w:ind w:left="360"/>
+        <w:rPr>
+          <w:rFonts w:ascii="Times New Roman" w:eastAsia="Times New Roman" w:hAnsi="Times New Roman" w:cs="Times New Roman"/>
+          <w:kern w:val="0"/>
+          <w:lang w:eastAsia="es-CO"/>
+          <w14:ligatures w14:val="none"/>
+        </w:rPr>
+      </w:pPr>
+      <w:r>
+        <w:rPr>
+          <w:rFonts w:ascii="Times New Roman" w:eastAsia="Times New Roman" w:hAnsi="Times New Roman" w:cs="Times New Roman"/>
+          <w:kern w:val="0"/>
+          <w:lang w:eastAsia="es-CO"/>
+          <w14:ligatures w14:val="none"/>
+        </w:rPr>
+        <w:t xml:space="preserve">Subir apuntes es rápido y no requiere organizar páginas complejas como en </w:t>
+      </w:r>
+      <w:proofErr w:type="spellStart"/>
+      <w:r>
+        <w:rPr>
+          <w:rFonts w:ascii="Times New Roman" w:eastAsia="Times New Roman" w:hAnsi="Times New Roman" w:cs="Times New Roman"/>
+          <w:kern w:val="0"/>
+          <w:lang w:eastAsia="es-CO"/>
+          <w14:ligatures w14:val="none"/>
+        </w:rPr>
+        <w:t>Notion</w:t>
+      </w:r>
+      <w:proofErr w:type="spellEnd"/>
+      <w:r>
+        <w:rPr>
+          <w:rFonts w:ascii="Times New Roman" w:eastAsia="Times New Roman" w:hAnsi="Times New Roman" w:cs="Times New Roman"/>
+          <w:kern w:val="0"/>
+          <w:lang w:eastAsia="es-CO"/>
+          <w14:ligatures w14:val="none"/>
+        </w:rPr>
+        <w:t>. Generalmente basta con subir el archivo y clasificarlo.</w:t>
+      </w:r>
+    </w:p>
+    <w:p>
+      <w:pPr>
+        <w:spacing w:after="0" w:line="240" w:lineRule="auto"/>
+        <w:ind w:left="360"/>
+        <w:rPr>
+          <w:rFonts w:ascii="Times New Roman" w:eastAsia="Times New Roman" w:hAnsi="Times New Roman" w:cs="Times New Roman"/>
+          <w:kern w:val="0"/>
+          <w:lang w:eastAsia="es-CO"/>
+          <w14:ligatures w14:val="none"/>
+        </w:rPr>
+      </w:pPr>
+      <w:r>
+        <w:rPr>
+          <w:rFonts w:ascii="Times New Roman" w:eastAsia="Times New Roman" w:hAnsi="Times New Roman" w:cs="Times New Roman"/>
+          <w:kern w:val="0"/>
+          <w:lang w:eastAsia="es-CO"/>
+          <w14:ligatures w14:val="none"/>
+        </w:rPr>
+        <w:t xml:space="preserve"> </w:t>
+      </w:r>
+    </w:p>
+    <w:p>
+      <w:pPr>
+        <w:pStyle w:val="Prrafodelista"/>
+        <w:numPr>
+          <w:ilvl w:val="0"/>
+          <w:numId w:val="2"/>
+        </w:numPr>
+        <w:spacing w:after="0" w:line="240" w:lineRule="auto"/>
+        <w:rPr>
+          <w:rFonts w:ascii="Times New Roman" w:eastAsia="Times New Roman" w:hAnsi="Times New Roman" w:cs="Times New Roman"/>
+          <w:kern w:val="0"/>
+          <w:lang w:eastAsia="es-CO"/>
+          <w14:ligatures w14:val="none"/>
+        </w:rPr>
+      </w:pPr>
+      <w:r>
+        <w:rPr>
+          <w:rFonts w:ascii="Times New Roman" w:eastAsia="Times New Roman" w:hAnsi="Times New Roman" w:cs="Times New Roman"/>
+          <w:b/>
+          <w:bCs/>
+          <w:kern w:val="0"/>
+          <w:lang w:eastAsia="es-CO"/>
+          <w14:ligatures w14:val="none"/>
+        </w:rPr>
+        <w:t>Sistema público y comunitario</w:t>
+      </w:r>
+    </w:p>
+    <w:p>
+      <w:pPr>
+        <w:spacing w:after="0" w:line="240" w:lineRule="auto"/>
+        <w:ind w:left="360"/>
+        <w:rPr>
+          <w:rFonts w:ascii="Times New Roman" w:eastAsia="Times New Roman" w:hAnsi="Times New Roman" w:cs="Times New Roman"/>
+          <w:kern w:val="0"/>
+          <w:lang w:eastAsia="es-CO"/>
+          <w14:ligatures w14:val="none"/>
+        </w:rPr>
+      </w:pPr>
+      <w:r>
+        <w:rPr>
+          <w:rFonts w:ascii="Times New Roman" w:eastAsia="Times New Roman" w:hAnsi="Times New Roman" w:cs="Times New Roman"/>
+          <w:kern w:val="0"/>
+          <w:lang w:eastAsia="es-CO"/>
+          <w14:ligatures w14:val="none"/>
+        </w:rPr>
+        <w:t>Funciona más como una biblioteca colaborativa de estudiantes que como un espacio privado de productividad</w:t>
+      </w:r>
+    </w:p>
+    <w:p>
+      <w:pPr>
+        <w:spacing w:after="0" w:line="240" w:lineRule="auto"/>
+        <w:ind w:left="360"/>
+        <w:rPr>
+          <w:rFonts w:ascii="Times New Roman" w:eastAsia="Times New Roman" w:hAnsi="Times New Roman" w:cs="Times New Roman"/>
+          <w:kern w:val="0"/>
+          <w:lang w:eastAsia="es-CO"/>
+          <w14:ligatures w14:val="none"/>
+        </w:rPr>
+      </w:pPr>
+    </w:p>
+    <w:p>
+      <w:pPr>
+        <w:pStyle w:val="Prrafodelista"/>
+        <w:numPr>
+          <w:ilvl w:val="0"/>
+          <w:numId w:val="2"/>
+        </w:numPr>
+        <w:spacing w:after="0" w:line="240" w:lineRule="auto"/>
+        <w:rPr>
+          <w:rFonts w:ascii="Times New Roman" w:eastAsia="Times New Roman" w:hAnsi="Times New Roman" w:cs="Times New Roman"/>
+          <w:kern w:val="0"/>
+          <w:lang w:eastAsia="es-CO"/>
+          <w14:ligatures w14:val="none"/>
+        </w:rPr>
+      </w:pPr>
+      <w:r>
+        <w:rPr>
+          <w:rFonts w:ascii="Times New Roman" w:eastAsia="Times New Roman" w:hAnsi="Times New Roman" w:cs="Times New Roman"/>
+          <w:kern w:val="0"/>
+          <w:lang w:eastAsia="es-CO"/>
+          <w14:ligatures w14:val="none"/>
+        </w:rPr>
+        <w:t>Posibilidad de monetización</w:t>
+      </w:r>
+    </w:p>
+    <w:p>
+      <w:pPr>
+        <w:spacing w:after="0" w:line="240" w:lineRule="auto"/>
+        <w:ind w:left="360"/>
+        <w:rPr>
+          <w:rFonts w:ascii="Times New Roman" w:eastAsia="Times New Roman" w:hAnsi="Times New Roman" w:cs="Times New Roman"/>
+          <w:kern w:val="0"/>
+          <w:lang w:eastAsia="es-CO"/>
+          <w14:ligatures w14:val="none"/>
+        </w:rPr>
+      </w:pPr>
+      <w:r>
+        <w:rPr>
+          <w:rFonts w:ascii="Times New Roman" w:eastAsia="Times New Roman" w:hAnsi="Times New Roman" w:cs="Times New Roman"/>
+          <w:kern w:val="0"/>
+          <w:lang w:eastAsia="es-CO"/>
+          <w14:ligatures w14:val="none"/>
+        </w:rPr>
+        <w:t>Algunos usuarios pueden generar ingresos por descargas o visualizaciones de sus apuntes.</w:t>
+      </w:r>
+    </w:p>
+    <w:p>
+      <w:pPr>
+        <w:spacing w:after="0" w:line="240" w:lineRule="auto"/>
+        <w:ind w:left="360"/>
+        <w:rPr>
+          <w:rFonts w:ascii="Times New Roman" w:eastAsia="Times New Roman" w:hAnsi="Times New Roman" w:cs="Times New Roman"/>
+          <w:kern w:val="0"/>
+          <w:lang w:eastAsia="es-CO"/>
+          <w14:ligatures w14:val="none"/>
+        </w:rPr>
+      </w:pPr>
+    </w:p>
+    <w:p>
+      <w:pPr>
+        <w:spacing w:after="0" w:line="240" w:lineRule="auto"/>
+        <w:ind w:left="360"/>
+        <w:rPr>
+          <w:rFonts w:ascii="Times New Roman" w:eastAsia="Times New Roman" w:hAnsi="Times New Roman" w:cs="Times New Roman"/>
+          <w:b/>
+          <w:bCs/>
+          <w:kern w:val="0"/>
+          <w:sz w:val="36"/>
+          <w:szCs w:val="36"/>
+          <w:lang w:eastAsia="es-CO"/>
+          <w14:ligatures w14:val="none"/>
+        </w:rPr>
+      </w:pPr>
+    </w:p>
+    <w:p>
+      <w:pPr>
+        <w:spacing w:after="0" w:line="240" w:lineRule="auto"/>
+        <w:rPr>
+          <w:rFonts w:ascii="Times New Roman" w:eastAsia="Times New Roman" w:hAnsi="Times New Roman" w:cs="Times New Roman"/>
+          <w:b/>
+          <w:bCs/>
+          <w:kern w:val="0"/>
+          <w:sz w:val="36"/>
+          <w:szCs w:val="36"/>
+          <w:lang w:eastAsia="es-CO"/>
+          <w14:ligatures w14:val="none"/>
+        </w:rPr>
+      </w:pPr>
+      <w:r>
+        <w:rPr>
+          <w:rFonts w:ascii="Times New Roman" w:eastAsia="Times New Roman" w:hAnsi="Times New Roman" w:cs="Times New Roman"/>
+          <w:b/>
+          <w:bCs/>
+          <w:kern w:val="0"/>
+          <w:sz w:val="36"/>
+          <w:szCs w:val="36"/>
+          <w:lang w:eastAsia="es-CO"/>
+          <w14:ligatures w14:val="none"/>
+        </w:rPr>
+        <w:t>Debilidades:</w:t>
+      </w:r>
+    </w:p>
+    <w:p>
+      <w:pPr>
+        <w:spacing w:after="0" w:line="240" w:lineRule="auto"/>
+        <w:rPr>
+          <w:rFonts w:ascii="Times New Roman" w:eastAsia="Times New Roman" w:hAnsi="Times New Roman" w:cs="Times New Roman"/>
+          <w:b/>
+          <w:bCs/>
+          <w:kern w:val="0"/>
+          <w:sz w:val="36"/>
+          <w:szCs w:val="36"/>
+          <w:lang w:eastAsia="es-CO"/>
+          <w14:ligatures w14:val="none"/>
+        </w:rPr>
+      </w:pPr>
+    </w:p>
+    <w:p>
+      <w:pPr>
+        <w:pStyle w:val="Prrafodelista"/>
+        <w:numPr>
+          <w:ilvl w:val="0"/>
+          <w:numId w:val="2"/>
+        </w:numPr>
+        <w:spacing w:after="0" w:line="240" w:lineRule="auto"/>
+        <w:rPr>
+          <w:rFonts w:ascii="Times New Roman" w:eastAsia="Times New Roman" w:hAnsi="Times New Roman" w:cs="Times New Roman"/>
+          <w:b/>
+          <w:bCs/>
+          <w:kern w:val="0"/>
+          <w:lang w:eastAsia="es-CO"/>
+          <w14:ligatures w14:val="none"/>
+        </w:rPr>
+      </w:pPr>
+      <w:r>
+        <w:rPr>
+          <w:rFonts w:ascii="Times New Roman" w:eastAsia="Times New Roman" w:hAnsi="Times New Roman" w:cs="Times New Roman"/>
+          <w:kern w:val="0"/>
+          <w:lang w:eastAsia="es-CO"/>
+          <w14:ligatures w14:val="none"/>
+        </w:rPr>
+        <w:t>No</w:t>
+      </w:r>
+      <w:r>
+        <w:rPr>
+          <w:rFonts w:ascii="Times New Roman" w:eastAsia="Times New Roman" w:hAnsi="Times New Roman" w:cs="Times New Roman"/>
+          <w:b/>
+          <w:bCs/>
+          <w:kern w:val="0"/>
+          <w:lang w:eastAsia="es-CO"/>
+          <w14:ligatures w14:val="none"/>
+        </w:rPr>
+        <w:t xml:space="preserve"> es una herramienta real de toma de apuntes</w:t>
+      </w:r>
+    </w:p>
+    <w:p>
+      <w:pPr>
+        <w:spacing w:after="0" w:line="240" w:lineRule="auto"/>
+        <w:rPr>
+          <w:rFonts w:ascii="Times New Roman" w:eastAsia="Times New Roman" w:hAnsi="Times New Roman" w:cs="Times New Roman"/>
+          <w:b/>
+          <w:bCs/>
+          <w:kern w:val="0"/>
+          <w:lang w:eastAsia="es-CO"/>
+          <w14:ligatures w14:val="none"/>
+        </w:rPr>
+      </w:pPr>
+      <w:r>
+        <w:rPr>
+          <w:rFonts w:ascii="Times New Roman" w:eastAsia="Times New Roman" w:hAnsi="Times New Roman" w:cs="Times New Roman"/>
+          <w:b/>
+          <w:bCs/>
+          <w:kern w:val="0"/>
+          <w:lang w:eastAsia="es-CO"/>
+          <w14:ligatures w14:val="none"/>
+        </w:rPr>
+        <w:t xml:space="preserve">A diferencia de </w:t>
+      </w:r>
+      <w:proofErr w:type="spellStart"/>
+      <w:r>
+        <w:rPr>
+          <w:rFonts w:ascii="Times New Roman" w:eastAsia="Times New Roman" w:hAnsi="Times New Roman" w:cs="Times New Roman"/>
+          <w:b/>
+          <w:bCs/>
+          <w:kern w:val="0"/>
+          <w:lang w:eastAsia="es-CO"/>
+          <w14:ligatures w14:val="none"/>
+        </w:rPr>
+        <w:t>Notion</w:t>
+      </w:r>
+      <w:proofErr w:type="spellEnd"/>
+      <w:r>
+        <w:rPr>
+          <w:rFonts w:ascii="Times New Roman" w:eastAsia="Times New Roman" w:hAnsi="Times New Roman" w:cs="Times New Roman"/>
+          <w:b/>
+          <w:bCs/>
+          <w:kern w:val="0"/>
+          <w:lang w:eastAsia="es-CO"/>
+          <w14:ligatures w14:val="none"/>
+        </w:rPr>
+        <w:t xml:space="preserve">, OneNote u Obsidian, Wuolah no está pensado para crear y organizar notas dentro de la plataforma. Es </w:t>
+      </w:r>
+      <w:proofErr w:type="gramStart"/>
+      <w:r>
+        <w:rPr>
+          <w:rFonts w:ascii="Times New Roman" w:eastAsia="Times New Roman" w:hAnsi="Times New Roman" w:cs="Times New Roman"/>
+          <w:b/>
+          <w:bCs/>
+          <w:kern w:val="0"/>
+          <w:lang w:eastAsia="es-CO"/>
+          <w14:ligatures w14:val="none"/>
+        </w:rPr>
+        <w:t>más</w:t>
+      </w:r>
+      <w:proofErr w:type="gramEnd"/>
+      <w:r>
+        <w:rPr>
+          <w:rFonts w:ascii="Times New Roman" w:eastAsia="Times New Roman" w:hAnsi="Times New Roman" w:cs="Times New Roman"/>
+          <w:b/>
+          <w:bCs/>
+          <w:kern w:val="0"/>
+          <w:lang w:eastAsia="es-CO"/>
+          <w14:ligatures w14:val="none"/>
+        </w:rPr>
+        <w:t xml:space="preserve"> un repositorio de archivos.</w:t>
+      </w:r>
+    </w:p>
+    <w:p>
+      <w:pPr>
+        <w:spacing w:after="0" w:line="240" w:lineRule="auto"/>
+        <w:rPr>
+          <w:rFonts w:ascii="Times New Roman" w:eastAsia="Times New Roman" w:hAnsi="Times New Roman" w:cs="Times New Roman"/>
+          <w:b/>
+          <w:bCs/>
+          <w:kern w:val="0"/>
+          <w:lang w:eastAsia="es-CO"/>
+          <w14:ligatures w14:val="none"/>
+        </w:rPr>
+      </w:pPr>
+    </w:p>
+    <w:p>
+      <w:pPr>
+        <w:pStyle w:val="Prrafodelista"/>
+        <w:numPr>
+          <w:ilvl w:val="0"/>
+          <w:numId w:val="2"/>
+        </w:numPr>
+        <w:spacing w:after="0" w:line="240" w:lineRule="auto"/>
+        <w:rPr>
+          <w:rFonts w:ascii="Times New Roman" w:eastAsia="Times New Roman" w:hAnsi="Times New Roman" w:cs="Times New Roman"/>
+          <w:b/>
+          <w:bCs/>
+          <w:kern w:val="0"/>
+          <w:lang w:eastAsia="es-CO"/>
+          <w14:ligatures w14:val="none"/>
+        </w:rPr>
+      </w:pPr>
+      <w:r>
+        <w:rPr>
+          <w:rFonts w:ascii="Times New Roman" w:eastAsia="Times New Roman" w:hAnsi="Times New Roman" w:cs="Times New Roman"/>
+          <w:b/>
+          <w:bCs/>
+          <w:kern w:val="0"/>
+          <w:lang w:eastAsia="es-CO"/>
+          <w14:ligatures w14:val="none"/>
+        </w:rPr>
+        <w:t>Menos colaboración en tiempo real</w:t>
+      </w:r>
+    </w:p>
+    <w:p>
+      <w:pPr>
+        <w:spacing w:after="0" w:line="240" w:lineRule="auto"/>
+        <w:rPr>
+          <w:rFonts w:ascii="Times New Roman" w:eastAsia="Times New Roman" w:hAnsi="Times New Roman" w:cs="Times New Roman"/>
+          <w:b/>
+          <w:bCs/>
+          <w:kern w:val="0"/>
+          <w:lang w:eastAsia="es-CO"/>
+          <w14:ligatures w14:val="none"/>
+        </w:rPr>
+      </w:pPr>
+      <w:r>
+        <w:rPr>
+          <w:rFonts w:ascii="Times New Roman" w:eastAsia="Times New Roman" w:hAnsi="Times New Roman" w:cs="Times New Roman"/>
+          <w:b/>
+          <w:bCs/>
+          <w:kern w:val="0"/>
+          <w:lang w:eastAsia="es-CO"/>
+          <w14:ligatures w14:val="none"/>
+        </w:rPr>
+        <w:t xml:space="preserve">No tiene edición colaborativa avanzada tipo Google </w:t>
+      </w:r>
+      <w:proofErr w:type="spellStart"/>
+      <w:r>
+        <w:rPr>
+          <w:rFonts w:ascii="Times New Roman" w:eastAsia="Times New Roman" w:hAnsi="Times New Roman" w:cs="Times New Roman"/>
+          <w:b/>
+          <w:bCs/>
+          <w:kern w:val="0"/>
+          <w:lang w:eastAsia="es-CO"/>
+          <w14:ligatures w14:val="none"/>
+        </w:rPr>
+        <w:t>Docs</w:t>
+      </w:r>
+      <w:proofErr w:type="spellEnd"/>
+      <w:r>
+        <w:rPr>
+          <w:rFonts w:ascii="Times New Roman" w:eastAsia="Times New Roman" w:hAnsi="Times New Roman" w:cs="Times New Roman"/>
+          <w:b/>
+          <w:bCs/>
+          <w:kern w:val="0"/>
+          <w:lang w:eastAsia="es-CO"/>
+          <w14:ligatures w14:val="none"/>
+        </w:rPr>
+        <w:t xml:space="preserve"> o </w:t>
+      </w:r>
+      <w:proofErr w:type="spellStart"/>
+      <w:r>
+        <w:rPr>
+          <w:rFonts w:ascii="Times New Roman" w:eastAsia="Times New Roman" w:hAnsi="Times New Roman" w:cs="Times New Roman"/>
+          <w:b/>
+          <w:bCs/>
+          <w:kern w:val="0"/>
+          <w:lang w:eastAsia="es-CO"/>
+          <w14:ligatures w14:val="none"/>
+        </w:rPr>
+        <w:t>Notion</w:t>
+      </w:r>
+      <w:proofErr w:type="spellEnd"/>
+      <w:r>
+        <w:rPr>
+          <w:rFonts w:ascii="Times New Roman" w:eastAsia="Times New Roman" w:hAnsi="Times New Roman" w:cs="Times New Roman"/>
+          <w:b/>
+          <w:bCs/>
+          <w:kern w:val="0"/>
+          <w:lang w:eastAsia="es-CO"/>
+          <w14:ligatures w14:val="none"/>
+        </w:rPr>
+        <w:t>.</w:t>
+      </w:r>
+    </w:p>
+    <w:p>
+      <w:pPr>
+        <w:spacing w:after="0" w:line="240" w:lineRule="auto"/>
+        <w:ind w:left="360"/>
+        <w:rPr>
+          <w:rFonts w:ascii="Times New Roman" w:eastAsia="Times New Roman" w:hAnsi="Times New Roman" w:cs="Times New Roman"/>
+          <w:kern w:val="0"/>
+          <w:lang w:eastAsia="es-CO"/>
+          <w14:ligatures w14:val="none"/>
+        </w:rPr>
+      </w:pPr>
+    </w:p>
+    <w:p>
+      <w:pPr>
+        <w:pStyle w:val="Prrafodelista"/>
+      </w:pPr>
+      <w:r>
+        <w:br w:type="page"/>
+      </w:r>
+    </w:p>
+    <w:p>
+      <w:pPr>
+        <w:pStyle w:val="Ttulo2"/>
+        <w:numPr>
+          <w:ilvl w:val="0"/>
+          <w:numId w:val="1"/>
+        </w:numPr>
+      </w:pPr>
+      <w:r>
+        <w:lastRenderedPageBreak/>
+        <w:t>Personas y casos de uso</w:t>
+      </w:r>
+    </w:p>
+    <w:p>
+      <w:r>
+        <w:t>Usuarios objetivo</w:t>
+      </w:r>
+      <w:r>
+        <w:t>:</w:t>
+      </w:r>
+    </w:p>
+    <w:p/>
+    <w:p>
+      <w:r>
+        <w:t xml:space="preserve">El estudiante nuevo — primer </w:t>
+      </w:r>
+      <w:r>
+        <w:t>acercamiento</w:t>
+      </w:r>
+      <w:r>
+        <w:t xml:space="preserve">, no tiene red de contactos, necesita </w:t>
+      </w:r>
+      <w:r>
+        <w:t>apuntes urgentes</w:t>
+      </w:r>
+    </w:p>
+    <w:p>
+      <w:r>
+        <w:t xml:space="preserve">El estudiante colaborador — tiene buenos apuntes y quiere </w:t>
+      </w:r>
+      <w:r>
+        <w:t>compartirlos,</w:t>
+      </w:r>
+      <w:r>
+        <w:t xml:space="preserve"> pero no sabe dónde</w:t>
+      </w:r>
+    </w:p>
+    <w:p>
+      <w:r>
+        <w:t>El estudiante de últimas horas — busca resúmenes rápidos antes de un parcial</w:t>
+      </w:r>
+    </w:p>
+    <w:p>
+      <w:r>
+        <w:t xml:space="preserve">El estudiante ausente – Suele faltar a las clases por motivos </w:t>
+      </w:r>
+      <w:proofErr w:type="gramStart"/>
+      <w:r>
+        <w:t>externos</w:t>
+      </w:r>
+      <w:proofErr w:type="gramEnd"/>
+      <w:r>
+        <w:t xml:space="preserve"> pero no quiere quedarse demasiado atrás en el temario</w:t>
+      </w:r>
+    </w:p>
+    <w:p>
+      <w:r>
+        <w:t>El monitor/tutor — sube material de calidad y quiere reconocimiento por ello</w:t>
+      </w:r>
+    </w:p>
+    <w:p/>
+    <w:p>
+      <w:pPr>
+        <w:rPr>
+          <w:rFonts w:ascii="Times New Roman" w:hAnsi="Times New Roman" w:cs="Times New Roman"/>
+        </w:rPr>
+      </w:pPr>
+    </w:p>
     <w:p>
       <w:pPr>
         <w:rPr>
@@ -17,6 +1453,251 @@
     </w:sectPr>
   </w:body>
 </w:document>
+</file>
+
+<file path=word/numbering.xml><?xml version="1.0" encoding="utf-8"?>
+<w:numbering xmlns:wpc="http://schemas.microsoft.com/office/word/2010/wordprocessingCanvas" xmlns:cx="http://schemas.microsoft.com/office/drawing/2014/chartex" xmlns:cx1="http://schemas.microsoft.com/office/drawing/2015/9/8/chartex" xmlns:cx2="http://schemas.microsoft.com/office/drawing/2015/10/21/chartex" xmlns:cx3="http://schemas.microsoft.com/office/drawing/2016/5/9/chartex" xmlns:cx4="http://schemas.microsoft.com/office/drawing/2016/5/10/chartex" xmlns:cx5="http://schemas.microsoft.com/office/drawing/2016/5/11/chartex" xmlns:cx6="http://schemas.microsoft.com/office/drawing/2016/5/12/chartex" xmlns:cx7="http://schemas.microsoft.com/office/drawing/2016/5/13/chartex" xmlns:cx8="http://schemas.microsoft.com/office/drawing/2016/5/14/chartex" xmlns:mc="http://schemas.openxmlformats.org/markup-compatibility/2006" xmlns:aink="http://schemas.microsoft.com/office/drawing/2016/ink" xmlns:am3d="http://schemas.microsoft.com/office/drawing/2017/model3d" xmlns:o="urn:schemas-microsoft-com:office:office" xmlns:oel="http://schemas.microsoft.com/office/2019/extlst" xmlns:r="http://schemas.openxmlformats.org/officeDocument/2006/relationships" xmlns:m="http://schemas.openxmlformats.org/officeDocument/2006/math" xmlns:v="urn:schemas-microsoft-com:vml" xmlns:wp14="http://schemas.microsoft.com/office/word/2010/wordprocessingDrawing" xmlns:wp="http://schemas.openxmlformats.org/drawingml/2006/wordprocessingDrawing" xmlns:w10="urn:schemas-microsoft-com:office:word" xmlns:w="http://schemas.openxmlformats.org/wordprocessingml/2006/main" xmlns:w14="http://schemas.microsoft.com/office/word/2010/wordml" xmlns:w15="http://schemas.microsoft.com/office/word/2012/wordml" xmlns:w16cex="http://schemas.microsoft.com/office/word/2018/wordml/cex" xmlns:w16cid="http://schemas.microsoft.com/office/word/2016/wordml/cid" xmlns:w16="http://schemas.microsoft.com/office/word/2018/wordml" xmlns:w16du="http://schemas.microsoft.com/office/word/2023/wordml/word16du" xmlns:w16sdtdh="http://schemas.microsoft.com/office/word/2020/wordml/sdtdatahash" xmlns:w16sdtfl="http://schemas.microsoft.com/office/word/2024/wordml/sdtformatlock" xmlns:w16se="http://schemas.microsoft.com/office/word/2015/wordml/symex" xmlns:wpg="http://schemas.microsoft.com/office/word/2010/wordprocessingGroup" xmlns:wpi="http://schemas.microsoft.com/office/word/2010/wordprocessingInk" xmlns:wne="http://schemas.microsoft.com/office/word/2006/wordml" xmlns:wps="http://schemas.microsoft.com/office/word/2010/wordprocessingShape" mc:Ignorable="w14 w15 w16se w16cid w16 w16cex w16sdtdh w16sdtfl w16du wp14">
+  <w:abstractNum w:abstractNumId="0" w15:restartNumberingAfterBreak="0">
+    <w:nsid w:val="022C01AA"/>
+    <w:multiLevelType w:val="multilevel"/>
+    <w:tmpl w:val="0ACCB280"/>
+    <w:lvl w:ilvl="0">
+      <w:start w:val="1"/>
+      <w:numFmt w:val="decimal"/>
+      <w:lvlText w:val="%1."/>
+      <w:lvlJc w:val="left"/>
+      <w:pPr>
+        <w:ind w:left="720" w:hanging="360"/>
+      </w:pPr>
+      <w:rPr>
+        <w:rFonts w:hint="default"/>
+      </w:rPr>
+    </w:lvl>
+    <w:lvl w:ilvl="1">
+      <w:start w:val="1"/>
+      <w:numFmt w:val="decimal"/>
+      <w:isLgl/>
+      <w:lvlText w:val="%1.%2"/>
+      <w:lvlJc w:val="left"/>
+      <w:pPr>
+        <w:ind w:left="1080" w:hanging="720"/>
+      </w:pPr>
+      <w:rPr>
+        <w:rFonts w:hint="default"/>
+      </w:rPr>
+    </w:lvl>
+    <w:lvl w:ilvl="2">
+      <w:start w:val="1"/>
+      <w:numFmt w:val="decimal"/>
+      <w:isLgl/>
+      <w:lvlText w:val="%1.%2.%3"/>
+      <w:lvlJc w:val="left"/>
+      <w:pPr>
+        <w:ind w:left="1080" w:hanging="720"/>
+      </w:pPr>
+      <w:rPr>
+        <w:rFonts w:hint="default"/>
+      </w:rPr>
+    </w:lvl>
+    <w:lvl w:ilvl="3">
+      <w:start w:val="1"/>
+      <w:numFmt w:val="decimal"/>
+      <w:isLgl/>
+      <w:lvlText w:val="%1.%2.%3.%4"/>
+      <w:lvlJc w:val="left"/>
+      <w:pPr>
+        <w:ind w:left="1440" w:hanging="1080"/>
+      </w:pPr>
+      <w:rPr>
+        <w:rFonts w:hint="default"/>
+      </w:rPr>
+    </w:lvl>
+    <w:lvl w:ilvl="4">
+      <w:start w:val="1"/>
+      <w:numFmt w:val="decimal"/>
+      <w:isLgl/>
+      <w:lvlText w:val="%1.%2.%3.%4.%5"/>
+      <w:lvlJc w:val="left"/>
+      <w:pPr>
+        <w:ind w:left="1800" w:hanging="1440"/>
+      </w:pPr>
+      <w:rPr>
+        <w:rFonts w:hint="default"/>
+      </w:rPr>
+    </w:lvl>
+    <w:lvl w:ilvl="5">
+      <w:start w:val="1"/>
+      <w:numFmt w:val="decimal"/>
+      <w:isLgl/>
+      <w:lvlText w:val="%1.%2.%3.%4.%5.%6"/>
+      <w:lvlJc w:val="left"/>
+      <w:pPr>
+        <w:ind w:left="1800" w:hanging="1440"/>
+      </w:pPr>
+      <w:rPr>
+        <w:rFonts w:hint="default"/>
+      </w:rPr>
+    </w:lvl>
+    <w:lvl w:ilvl="6">
+      <w:start w:val="1"/>
+      <w:numFmt w:val="decimal"/>
+      <w:isLgl/>
+      <w:lvlText w:val="%1.%2.%3.%4.%5.%6.%7"/>
+      <w:lvlJc w:val="left"/>
+      <w:pPr>
+        <w:ind w:left="2160" w:hanging="1800"/>
+      </w:pPr>
+      <w:rPr>
+        <w:rFonts w:hint="default"/>
+      </w:rPr>
+    </w:lvl>
+    <w:lvl w:ilvl="7">
+      <w:start w:val="1"/>
+      <w:numFmt w:val="decimal"/>
+      <w:isLgl/>
+      <w:lvlText w:val="%1.%2.%3.%4.%5.%6.%7.%8"/>
+      <w:lvlJc w:val="left"/>
+      <w:pPr>
+        <w:ind w:left="2520" w:hanging="2160"/>
+      </w:pPr>
+      <w:rPr>
+        <w:rFonts w:hint="default"/>
+      </w:rPr>
+    </w:lvl>
+    <w:lvl w:ilvl="8">
+      <w:start w:val="1"/>
+      <w:numFmt w:val="decimal"/>
+      <w:isLgl/>
+      <w:lvlText w:val="%1.%2.%3.%4.%5.%6.%7.%8.%9"/>
+      <w:lvlJc w:val="left"/>
+      <w:pPr>
+        <w:ind w:left="2520" w:hanging="2160"/>
+      </w:pPr>
+      <w:rPr>
+        <w:rFonts w:hint="default"/>
+      </w:rPr>
+    </w:lvl>
+  </w:abstractNum>
+  <w:abstractNum w:abstractNumId="1" w15:restartNumberingAfterBreak="0">
+    <w:nsid w:val="15727491"/>
+    <w:multiLevelType w:val="hybridMultilevel"/>
+    <w:tmpl w:val="2112300E"/>
+    <w:lvl w:ilvl="0" w:tplc="80AA816A">
+      <w:start w:val="3"/>
+      <w:numFmt w:val="bullet"/>
+      <w:lvlText w:val="-"/>
+      <w:lvlJc w:val="left"/>
+      <w:pPr>
+        <w:ind w:left="720" w:hanging="360"/>
+      </w:pPr>
+      <w:rPr>
+        <w:rFonts w:ascii="Aptos" w:eastAsiaTheme="minorHAnsi" w:hAnsi="Aptos" w:cstheme="minorBidi" w:hint="default"/>
+      </w:rPr>
+    </w:lvl>
+    <w:lvl w:ilvl="1" w:tplc="240A0003" w:tentative="1">
+      <w:start w:val="1"/>
+      <w:numFmt w:val="bullet"/>
+      <w:lvlText w:val="o"/>
+      <w:lvlJc w:val="left"/>
+      <w:pPr>
+        <w:ind w:left="1440" w:hanging="360"/>
+      </w:pPr>
+      <w:rPr>
+        <w:rFonts w:ascii="Courier New" w:hAnsi="Courier New" w:cs="Courier New" w:hint="default"/>
+      </w:rPr>
+    </w:lvl>
+    <w:lvl w:ilvl="2" w:tplc="240A0005" w:tentative="1">
+      <w:start w:val="1"/>
+      <w:numFmt w:val="bullet"/>
+      <w:lvlText w:val=""/>
+      <w:lvlJc w:val="left"/>
+      <w:pPr>
+        <w:ind w:left="2160" w:hanging="360"/>
+      </w:pPr>
+      <w:rPr>
+        <w:rFonts w:ascii="Wingdings" w:hAnsi="Wingdings" w:hint="default"/>
+      </w:rPr>
+    </w:lvl>
+    <w:lvl w:ilvl="3" w:tplc="240A0001" w:tentative="1">
+      <w:start w:val="1"/>
+      <w:numFmt w:val="bullet"/>
+      <w:lvlText w:val=""/>
+      <w:lvlJc w:val="left"/>
+      <w:pPr>
+        <w:ind w:left="2880" w:hanging="360"/>
+      </w:pPr>
+      <w:rPr>
+        <w:rFonts w:ascii="Symbol" w:hAnsi="Symbol" w:hint="default"/>
+      </w:rPr>
+    </w:lvl>
+    <w:lvl w:ilvl="4" w:tplc="240A0003" w:tentative="1">
+      <w:start w:val="1"/>
+      <w:numFmt w:val="bullet"/>
+      <w:lvlText w:val="o"/>
+      <w:lvlJc w:val="left"/>
+      <w:pPr>
+        <w:ind w:left="3600" w:hanging="360"/>
+      </w:pPr>
+      <w:rPr>
+        <w:rFonts w:ascii="Courier New" w:hAnsi="Courier New" w:cs="Courier New" w:hint="default"/>
+      </w:rPr>
+    </w:lvl>
+    <w:lvl w:ilvl="5" w:tplc="240A0005" w:tentative="1">
+      <w:start w:val="1"/>
+      <w:numFmt w:val="bullet"/>
+      <w:lvlText w:val=""/>
+      <w:lvlJc w:val="left"/>
+      <w:pPr>
+        <w:ind w:left="4320" w:hanging="360"/>
+      </w:pPr>
+      <w:rPr>
+        <w:rFonts w:ascii="Wingdings" w:hAnsi="Wingdings" w:hint="default"/>
+      </w:rPr>
+    </w:lvl>
+    <w:lvl w:ilvl="6" w:tplc="240A0001" w:tentative="1">
+      <w:start w:val="1"/>
+      <w:numFmt w:val="bullet"/>
+      <w:lvlText w:val=""/>
+      <w:lvlJc w:val="left"/>
+      <w:pPr>
+        <w:ind w:left="5040" w:hanging="360"/>
+      </w:pPr>
+      <w:rPr>
+        <w:rFonts w:ascii="Symbol" w:hAnsi="Symbol" w:hint="default"/>
+      </w:rPr>
+    </w:lvl>
+    <w:lvl w:ilvl="7" w:tplc="240A0003" w:tentative="1">
+      <w:start w:val="1"/>
+      <w:numFmt w:val="bullet"/>
+      <w:lvlText w:val="o"/>
+      <w:lvlJc w:val="left"/>
+      <w:pPr>
+        <w:ind w:left="5760" w:hanging="360"/>
+      </w:pPr>
+      <w:rPr>
+        <w:rFonts w:ascii="Courier New" w:hAnsi="Courier New" w:cs="Courier New" w:hint="default"/>
+      </w:rPr>
+    </w:lvl>
+    <w:lvl w:ilvl="8" w:tplc="240A0005" w:tentative="1">
+      <w:start w:val="1"/>
+      <w:numFmt w:val="bullet"/>
+      <w:lvlText w:val=""/>
+      <w:lvlJc w:val="left"/>
+      <w:pPr>
+        <w:ind w:left="6480" w:hanging="360"/>
+      </w:pPr>
+      <w:rPr>
+        <w:rFonts w:ascii="Wingdings" w:hAnsi="Wingdings" w:hint="default"/>
+      </w:rPr>
+    </w:lvl>
+  </w:abstractNum>
+  <w:num w:numId="1" w16cid:durableId="1488547382">
+    <w:abstractNumId w:val="0"/>
+  </w:num>
+  <w:num w:numId="2" w16cid:durableId="605505852">
+    <w:abstractNumId w:val="1"/>
+  </w:num>
+</w:numbering>
 </file>
 
 <file path=word/styles.xml><?xml version="1.0" encoding="utf-8"?>
@@ -447,7 +2128,6 @@
     <w:next w:val="Normal"/>
     <w:link w:val="Ttulo2Car"/>
     <w:uiPriority w:val="9"/>
-    <w:semiHidden/>
     <w:unhideWhenUsed/>
     <w:qFormat/>
     <w:rsid w:val="00900B42"/>
@@ -470,7 +2150,6 @@
     <w:next w:val="Normal"/>
     <w:link w:val="Ttulo3Car"/>
     <w:uiPriority w:val="9"/>
-    <w:semiHidden/>
     <w:unhideWhenUsed/>
     <w:qFormat/>
     <w:rsid w:val="00900B42"/>
@@ -622,7 +2301,6 @@
   <w:style w:type="character" w:default="1" w:styleId="Fuentedeprrafopredeter">
     <w:name w:val="Default Paragraph Font"/>
     <w:uiPriority w:val="1"/>
-    <w:semiHidden/>
     <w:unhideWhenUsed/>
   </w:style>
   <w:style w:type="table" w:default="1" w:styleId="Tablanormal">
@@ -664,7 +2342,6 @@
     <w:basedOn w:val="Fuentedeprrafopredeter"/>
     <w:link w:val="Ttulo2"/>
     <w:uiPriority w:val="9"/>
-    <w:semiHidden/>
     <w:rsid w:val="00900B42"/>
     <w:rPr>
       <w:rFonts w:asciiTheme="majorHAnsi" w:eastAsiaTheme="majorEastAsia" w:hAnsiTheme="majorHAnsi" w:cstheme="majorBidi"/>
@@ -678,7 +2355,6 @@
     <w:basedOn w:val="Fuentedeprrafopredeter"/>
     <w:link w:val="Ttulo3"/>
     <w:uiPriority w:val="9"/>
-    <w:semiHidden/>
     <w:rsid w:val="00900B42"/>
     <w:rPr>
       <w:rFonts w:eastAsiaTheme="majorEastAsia" w:cstheme="majorBidi"/>
@@ -934,6 +2610,26 @@
       <w:smallCaps/>
       <w:color w:val="0F4761" w:themeColor="accent1" w:themeShade="BF"/>
       <w:spacing w:val="5"/>
+    </w:rPr>
+  </w:style>
+  <w:style w:type="paragraph" w:styleId="Sinespaciado">
+    <w:name w:val="No Spacing"/>
+    <w:uiPriority w:val="1"/>
+    <w:qFormat/>
+    <w:rsid w:val="00E108CA"/>
+    <w:pPr>
+      <w:spacing w:after="0" w:line="240" w:lineRule="auto"/>
+    </w:pPr>
+  </w:style>
+  <w:style w:type="character" w:styleId="Fuerte">
+    <w:name w:val="Strong"/>
+    <w:basedOn w:val="Fuentedeprrafopredeter"/>
+    <w:uiPriority w:val="22"/>
+    <w:qFormat/>
+    <w:rsid w:val="001B3852"/>
+    <w:rPr>
+      <w:b/>
+      <w:bCs/>
     </w:rPr>
   </w:style>
 </w:styles>

</xml_diff>